<commit_message>
fix: automatizar verificacao do pacote de producao
</commit_message>
<xml_diff>
--- a/TrigoPDV_Instalacao_PenDrive/manual-de-uso/Manual_de_Uso_TrigoPDV.docx
+++ b/TrigoPDV_Instalacao_PenDrive/manual-de-uso/Manual_de_Uso_TrigoPDV.docx
@@ -28,11 +28,7 @@
         <w:keepLines/>
       </w:pPr>
       <w:r>
-        <w:rPr>
-          <w:b/>
-          <w:color w:val="8B5E19"/>
-        </w:rPr>
-        <w:t>Revisado em 05/09/2026</w:t>
+        <w:t>Revisado em 06/09/2026</w:t>
       </w:r>
     </w:p>
     <w:p>
@@ -72,7 +68,7 @@
         <w:pStyle w:val="NumberedStep"/>
       </w:pPr>
       <w:r>
-        <w:t>3. Execute instalador\Instalar_TrigoPDV.cmd e aguarde o atalho TrigoPDV.</w:t>
+        <w:t>3. Execute instalador\Instalar_TrigoPDV.cmd. Ele confere automaticamente todos os arquivos antes de abrir o Setup. Aguarde o atalho TrigoPDV.</w:t>
       </w:r>
     </w:p>
     <w:p>
@@ -112,7 +108,7 @@
         <w:keepLines/>
       </w:pPr>
       <w:r>
-        <w:t>Faça os testes antes do inventário definitivo:</w:t>
+        <w:t>Os cálculos, permissões, banco, backup, atualização e limpeza de treinamento já passam por testes automáticos. Na máquina da padaria, faça somente os testes que dependem dos equipamentos e serviços reais:</w:t>
       </w:r>
     </w:p>
     <w:p>
@@ -128,7 +124,7 @@
         <w:pStyle w:val="ListBullet"/>
       </w:pPr>
       <w:r>
-        <w:t>leia um produto comum e um produto por peso;</w:t>
+        <w:t>leia um produto comum com o leitor USB e inclua um item por peso;</w:t>
       </w:r>
     </w:p>
     <w:p>
@@ -136,7 +132,7 @@
         <w:pStyle w:val="ListBullet"/>
       </w:pPr>
       <w:r>
-        <w:t>abra um caixa de treinamento, faça uma venda curta em dinheiro e confira o troco e o comprovante;</w:t>
+        <w:t>faça uma venda curta em dinheiro e confira troco, papel, acentos e corte;</w:t>
       </w:r>
     </w:p>
     <w:p>
@@ -144,7 +140,7 @@
         <w:pStyle w:val="ListBullet"/>
       </w:pPr>
       <w:r>
-        <w:t>faça uma entrada e uma retirada pequenas;</w:t>
+        <w:t>simule falta de papel e use Segunda via, sem repetir a venda;</w:t>
       </w:r>
     </w:p>
     <w:p>
@@ -152,7 +148,7 @@
         <w:pStyle w:val="ListBullet"/>
       </w:pPr>
       <w:r>
-        <w:t>teste PIX e cartão, lembrando que a confirmação é feita pelo operador;</w:t>
+        <w:t>confirme um PIX no banco e um cartão na maquininha de treinamento;</w:t>
       </w:r>
     </w:p>
     <w:p>
@@ -160,7 +156,7 @@
         <w:pStyle w:val="ListBullet"/>
       </w:pPr>
       <w:r>
-        <w:t>cancele a venda de teste com um administrador e feche o caixa;</w:t>
+        <w:t>gere um backup em outro disco ou pen drive;</w:t>
       </w:r>
     </w:p>
     <w:p>
@@ -168,7 +164,7 @@
         <w:pStyle w:val="ListBullet"/>
       </w:pPr>
       <w:r>
-        <w:t>feche e abra o aplicativo para confirmar que não ficou nenhum processo preso.</w:t>
+        <w:t>feche e abra o aplicativo uma vez e confirme que o processo encerrou.</w:t>
       </w:r>
     </w:p>
     <w:p>

</xml_diff>